<commit_message>
Update EOD docx: add landing match + submit spinner to Oct 15
Co-Authored-By: Claude Opus 4.8 (1M context) <noreply@anthropic.com>
</commit_message>
<xml_diff>
--- a/EOD-Reports.docx
+++ b/EOD-Reports.docx
@@ -159,7 +159,7 @@
         <w:pStyle w:val="ListBullet"/>
       </w:pPr>
       <w:r>
-        <w:t>Responsive pass for tablet and mobile (single-column reflow)</w:t>
+        <w:t>Matched the landing page to the Figma (edge dotted-square motif and copy)</w:t>
       </w:r>
     </w:p>
     <w:p>
@@ -175,7 +175,31 @@
         <w:pStyle w:val="ListBullet"/>
       </w:pPr>
       <w:r>
+        <w:t>Added a centered loading spinner while the name/location submits</w:t>
+      </w:r>
+    </w:p>
+    <w:p>
+      <w:pPr>
+        <w:pStyle w:val="ListBullet"/>
+      </w:pPr>
+      <w:r>
+        <w:t>Responsive pass for tablet and mobile (single-column reflow)</w:t>
+      </w:r>
+    </w:p>
+    <w:p>
+      <w:pPr>
+        <w:pStyle w:val="ListBullet"/>
+      </w:pPr>
+      <w:r>
         <w:t>Deployed to our own Vercel site: https://skinstric1.vercel.app/</w:t>
+      </w:r>
+    </w:p>
+    <w:p>
+      <w:pPr>
+        <w:pStyle w:val="ListBullet"/>
+      </w:pPr>
+      <w:r>
+        <w:t>Build, lint, and type-check all passing</w:t>
       </w:r>
     </w:p>
     <w:p>
@@ -191,7 +215,7 @@
         <w:pStyle w:val="ListBullet"/>
       </w:pPr>
       <w:r>
-        <w:t>Fidelity pass on the landing and remaining Phase 1 screens vs the Figma</w:t>
+        <w:t>ENTER CODE feature: save a result under a short code and revisit it later</w:t>
       </w:r>
     </w:p>
     <w:p>
@@ -199,7 +223,7 @@
         <w:pStyle w:val="ListBullet"/>
       </w:pPr>
       <w:r>
-        <w:t>Polish and edge-case handling</w:t>
+        <w:t>Remaining Figma polish (loading motif, camera setup screen)</w:t>
       </w:r>
     </w:p>
     <w:sectPr>

</xml_diff>

<commit_message>
EOD docx: log ENTER CODE feature under Oct 15
Co-Authored-By: Claude Opus 4.8 (1M context) <noreply@anthropic.com>
</commit_message>
<xml_diff>
--- a/EOD-Reports.docx
+++ b/EOD-Reports.docx
@@ -183,6 +183,14 @@
         <w:pStyle w:val="ListBullet"/>
       </w:pPr>
       <w:r>
+        <w:t>Built the ENTER CODE feature: each analysis is saved under a short code; the header button opens a modal to revisit a saved result (verified end-to-end)</w:t>
+      </w:r>
+    </w:p>
+    <w:p>
+      <w:pPr>
+        <w:pStyle w:val="ListBullet"/>
+      </w:pPr>
+      <w:r>
         <w:t>Responsive pass for tablet and mobile (single-column reflow)</w:t>
       </w:r>
     </w:p>
@@ -215,7 +223,7 @@
         <w:pStyle w:val="ListBullet"/>
       </w:pPr>
       <w:r>
-        <w:t>ENTER CODE feature: save a result under a short code and revisit it later</w:t>
+        <w:t>Remaining Figma polish (loading motif, camera setup screen)</w:t>
       </w:r>
     </w:p>
     <w:p>
@@ -223,7 +231,7 @@
         <w:pStyle w:val="ListBullet"/>
       </w:pPr>
       <w:r>
-        <w:t>Remaining Figma polish (loading motif, camera setup screen)</w:t>
+        <w:t>Add MichelMitri1 as collaborator and share the EOD doc link in the chat</w:t>
       </w:r>
     </w:p>
     <w:sectPr>

</xml_diff>

<commit_message>
EOD docx: split ENTER CODE into its own Oct 17 entry
Co-Authored-By: Claude Opus 4.8 (1M context) <noreply@anthropic.com>
</commit_message>
<xml_diff>
--- a/EOD-Reports.docx
+++ b/EOD-Reports.docx
@@ -183,14 +183,6 @@
         <w:pStyle w:val="ListBullet"/>
       </w:pPr>
       <w:r>
-        <w:t>Built the ENTER CODE feature: each analysis is saved under a short code; the header button opens a modal to revisit a saved result (verified end-to-end)</w:t>
-      </w:r>
-    </w:p>
-    <w:p>
-      <w:pPr>
-        <w:pStyle w:val="ListBullet"/>
-      </w:pPr>
-      <w:r>
         <w:t>Responsive pass for tablet and mobile (single-column reflow)</w:t>
       </w:r>
     </w:p>
@@ -208,6 +200,70 @@
       </w:pPr>
       <w:r>
         <w:t>Build, lint, and type-check all passing</w:t>
+      </w:r>
+    </w:p>
+    <w:p>
+      <w:r>
+        <w:rPr>
+          <w:b/>
+        </w:rPr>
+        <w:t>Tomorrow:</w:t>
+      </w:r>
+    </w:p>
+    <w:p>
+      <w:pPr>
+        <w:pStyle w:val="ListBullet"/>
+      </w:pPr>
+      <w:r>
+        <w:t>ENTER CODE feature: save a result under a short code and revisit it later</w:t>
+      </w:r>
+    </w:p>
+    <w:p>
+      <w:pPr>
+        <w:pStyle w:val="ListBullet"/>
+      </w:pPr>
+      <w:r>
+        <w:t>Remaining Figma polish (loading motif, camera setup screen)</w:t>
+      </w:r>
+    </w:p>
+    <w:p>
+      <w:pPr>
+        <w:pStyle w:val="Heading2"/>
+      </w:pPr>
+      <w:r>
+        <w:t>October 17, 2026</w:t>
+      </w:r>
+    </w:p>
+    <w:p>
+      <w:r>
+        <w:rPr>
+          <w:b/>
+        </w:rPr>
+        <w:t>EOD:</w:t>
+      </w:r>
+    </w:p>
+    <w:p>
+      <w:pPr>
+        <w:pStyle w:val="ListBullet"/>
+      </w:pPr>
+      <w:r>
+        <w:t>Built the ENTER CODE feature: each analysis is saved under a short unambiguous code; the header button opens a modal to revisit a saved result</w:t>
+      </w:r>
+    </w:p>
+    <w:p>
+      <w:pPr>
+        <w:pStyle w:val="ListBullet"/>
+      </w:pPr>
+      <w:r>
+        <w:t>Verified the full flow end-to-end (valid code restores the result; unknown code shows an error)</w:t>
+      </w:r>
+    </w:p>
+    <w:p>
+      <w:pPr>
+        <w:pStyle w:val="ListBullet"/>
+      </w:pPr>
+      <w:r>
+        <w:t>Committed and deployed</w:t>
       </w:r>
     </w:p>
     <w:p>

</xml_diff>